<commit_message>
Fix OPUS metadata parsing for reverted history edits
</commit_message>
<xml_diff>
--- a/docs/SpectraViewer_User_Manual_1.1.6.docx
+++ b/docs/SpectraViewer_User_Manual_1.1.6.docx
@@ -6,6 +6,7 @@
       <w:pPr>
         <w:jc w:val="center"/>
       </w:pPr>
+      <w:proofErr w:type="spellStart"/>
       <w:r>
         <w:rPr>
           <w:b/>
@@ -14,6 +15,7 @@
         </w:rPr>
         <w:t>SpectraViewer</w:t>
       </w:r>
+      <w:proofErr w:type="spellEnd"/>
     </w:p>
     <w:p>
       <w:pPr>
@@ -35,7 +37,19 @@
         <w:rPr>
           <w:sz w:val="32"/>
         </w:rPr>
-        <w:t>Version 1.1.6</w:t>
+        <w:t xml:space="preserve">Version </w:t>
+      </w:r>
+      <w:r>
+        <w:rPr>
+          <w:sz w:val="32"/>
+        </w:rPr>
+        <w:t>1.1.</w:t>
+      </w:r>
+      <w:r>
+        <w:rPr>
+          <w:sz w:val="32"/>
+        </w:rPr>
+        <w:t>6 and later</w:t>
       </w:r>
     </w:p>
     <w:p/>
@@ -47,8 +61,8 @@
         <w:tblLook w:val="04A0" w:firstRow="1" w:lastRow="0" w:firstColumn="1" w:lastColumn="0" w:noHBand="0" w:noVBand="1"/>
       </w:tblPr>
       <w:tblGrid>
-        <w:gridCol w:w="5040"/>
-        <w:gridCol w:w="5040"/>
+        <w:gridCol w:w="5034"/>
+        <w:gridCol w:w="5036"/>
       </w:tblGrid>
       <w:tr>
         <w:trPr>
@@ -205,7 +219,7 @@
               <w:rPr>
                 <w:sz w:val="19"/>
               </w:rPr>
-              <w:t>10.5281/zenodo.20715099</w:t>
+              <w:t>10.5281/zenodo.20715098</w:t>
             </w:r>
           </w:p>
         </w:tc>
@@ -217,7 +231,21 @@
         <w:jc w:val="center"/>
       </w:pPr>
       <w:r>
-        <w:t>This manual describes the source-code version of SpectraViewer 1.1.6.</w:t>
+        <w:t xml:space="preserve">This manual describes the source-code version of </w:t>
+      </w:r>
+      <w:proofErr w:type="spellStart"/>
+      <w:r>
+        <w:t>SpectraViewer</w:t>
+      </w:r>
+      <w:proofErr w:type="spellEnd"/>
+      <w:r>
+        <w:t xml:space="preserve"> </w:t>
+      </w:r>
+      <w:r>
+        <w:t>1.1.</w:t>
+      </w:r>
+      <w:r>
+        <w:t>6 and later.</w:t>
       </w:r>
     </w:p>
     <w:p>
@@ -311,7 +339,16 @@
     </w:p>
     <w:p>
       <w:r>
-        <w:t>Appendix B. Version 1.1.6 change summary</w:t>
+        <w:t xml:space="preserve">Appendix B. Version </w:t>
+      </w:r>
+      <w:r>
+        <w:t>1.1.</w:t>
+      </w:r>
+      <w:r>
+        <w:t>6</w:t>
+      </w:r>
+      <w:r>
+        <w:t xml:space="preserve"> change summary</w:t>
       </w:r>
     </w:p>
     <w:p>
@@ -329,8 +366,13 @@
       </w:r>
     </w:p>
     <w:p>
-      <w:r>
-        <w:t>SpectraViewer is a lightweight desktop application for opening, browsing, and visually inspecting spectrum files. It is designed as a fast spectrum browser rather than a full spectrum-processing or spectrum-manipulation environment.</w:t>
+      <w:proofErr w:type="spellStart"/>
+      <w:r>
+        <w:t>SpectraViewer</w:t>
+      </w:r>
+      <w:proofErr w:type="spellEnd"/>
+      <w:r>
+        <w:t xml:space="preserve"> is a lightweight desktop application for opening, browsing, and visually inspecting spectrum files. It is designed as a fast spectrum browser rather than a full spectrum-processing or spectrum-manipulation environment.</w:t>
       </w:r>
     </w:p>
     <w:p>
@@ -339,8 +381,13 @@
       </w:r>
     </w:p>
     <w:p>
-      <w:r>
-        <w:t>SpectraViewer does not replace OPUS or other dedicated spectroscopy software. It does not perform spectral processing, manipulation, identification, or database searching. Its purpose is quick viewing and convenient browsing.</w:t>
+      <w:proofErr w:type="spellStart"/>
+      <w:r>
+        <w:t>SpectraViewer</w:t>
+      </w:r>
+      <w:proofErr w:type="spellEnd"/>
+      <w:r>
+        <w:t xml:space="preserve"> does not replace OPUS or other dedicated spectroscopy software. It does not perform spectral processing, manipulation, identification, or database searching. Its purpose is quick viewing and convenient browsing.</w:t>
       </w:r>
     </w:p>
     <w:p>
@@ -353,7 +400,24 @@
     </w:p>
     <w:p>
       <w:r>
-        <w:t>This manual explains the basic operating logic of SpectraViewer 1.1.6, the user interface elements, the supported file-loading workflows, and the practical limitations that users should be aware of.</w:t>
+        <w:t xml:space="preserve">This manual explains the basic operating logic of </w:t>
+      </w:r>
+      <w:proofErr w:type="spellStart"/>
+      <w:r>
+        <w:t>SpectraViewer</w:t>
+      </w:r>
+      <w:proofErr w:type="spellEnd"/>
+      <w:r>
+        <w:t xml:space="preserve"> </w:t>
+      </w:r>
+      <w:r>
+        <w:t>1.1.</w:t>
+      </w:r>
+      <w:r>
+        <w:t>6</w:t>
+      </w:r>
+      <w:r>
+        <w:t>, the user interface elements, the supported file-loading workflows, and the practical limitations that users should be aware of.</w:t>
       </w:r>
     </w:p>
     <w:p>
@@ -365,8 +429,13 @@
       </w:r>
     </w:p>
     <w:p>
-      <w:r>
-        <w:t>SpectraViewer currently supports the following file types:</w:t>
+      <w:proofErr w:type="spellStart"/>
+      <w:r>
+        <w:t>SpectraViewer</w:t>
+      </w:r>
+      <w:proofErr w:type="spellEnd"/>
+      <w:r>
+        <w:t xml:space="preserve"> currently supports the following file types:</w:t>
       </w:r>
     </w:p>
     <w:p>
@@ -382,7 +451,15 @@
         <w:pStyle w:val="Felsorols"/>
       </w:pPr>
       <w:r>
-        <w:t>JCAMP-DX spectrum files: .dx and .jdx.</w:t>
+        <w:t>JCAMP-DX spectrum files: .dx and .</w:t>
+      </w:r>
+      <w:proofErr w:type="spellStart"/>
+      <w:r>
+        <w:t>jdx</w:t>
+      </w:r>
+      <w:proofErr w:type="spellEnd"/>
+      <w:r>
+        <w:t>.</w:t>
       </w:r>
     </w:p>
     <w:p>
@@ -413,7 +490,15 @@
     </w:p>
     <w:p>
       <w:r>
-        <w:t>The operating logic of SpectraViewer differs from the traditional “open one file, display one file” approach. The program is primarily designed for browsing through spectrum collections without repeatedly opening individual files.</w:t>
+        <w:t xml:space="preserve">The operating logic of </w:t>
+      </w:r>
+      <w:proofErr w:type="spellStart"/>
+      <w:r>
+        <w:t>SpectraViewer</w:t>
+      </w:r>
+      <w:proofErr w:type="spellEnd"/>
+      <w:r>
+        <w:t xml:space="preserve"> differs from the traditional “open one file, display one file” approach. The program is primarily designed for browsing through spectrum collections without repeatedly opening individual files.</w:t>
       </w:r>
     </w:p>
     <w:p>
@@ -423,12 +508,28 @@
     </w:p>
     <w:p>
       <w:r>
-        <w:t>If Include subfolders is disabled, SpectraViewer builds the list from the supported spectrum files found directly in the folder that contains the opened file. If Include subfolders is enabled, the program scans the folder tree recursively and builds a single navigable list from all supported spectra found under that folder.</w:t>
-      </w:r>
-    </w:p>
-    <w:p>
-      <w:r>
-        <w:t>This design is especially useful when the goal is not the detailed analysis of a single file, but the fast visual inspection, checking, or comparison of a larger spectrum set. In this sense, SpectraViewer behaves more like a spectrum browser than a conventional spectrum viewer.</w:t>
+        <w:t xml:space="preserve">If Include subfolders is disabled, </w:t>
+      </w:r>
+      <w:proofErr w:type="spellStart"/>
+      <w:r>
+        <w:t>SpectraViewer</w:t>
+      </w:r>
+      <w:proofErr w:type="spellEnd"/>
+      <w:r>
+        <w:t xml:space="preserve"> builds the list from the supported spectrum files found directly in the folder that contains the opened file. If Include subfolders is enabled, the program scans the folder tree recursively and builds a single navigable list from all supported spectra found under that folder.</w:t>
+      </w:r>
+    </w:p>
+    <w:p>
+      <w:r>
+        <w:t xml:space="preserve">This design is especially useful when the goal is not the detailed analysis of a single file, but the fast visual inspection, checking, or comparison of a larger spectrum set. In this sense, </w:t>
+      </w:r>
+      <w:proofErr w:type="spellStart"/>
+      <w:r>
+        <w:t>SpectraViewer</w:t>
+      </w:r>
+      <w:proofErr w:type="spellEnd"/>
+      <w:r>
+        <w:t xml:space="preserve"> behaves more like a spectrum browser than a conventional spectrum viewer.</w:t>
       </w:r>
     </w:p>
     <w:p>
@@ -490,7 +591,31 @@
     </w:p>
     <w:p>
       <w:r>
-        <w:t>The GitHub release provides the source-code version of SpectraViewer. It is a Python/Tkinter application and is primarily developed and tested on Windows. The core program should remain portable as long as the required Python packages and Tcl/Tk support are available.</w:t>
+        <w:t xml:space="preserve">The GitHub release provides the source-code version of </w:t>
+      </w:r>
+      <w:proofErr w:type="spellStart"/>
+      <w:r>
+        <w:t>SpectraViewer</w:t>
+      </w:r>
+      <w:proofErr w:type="spellEnd"/>
+      <w:r>
+        <w:t>. It is a Python/</w:t>
+      </w:r>
+      <w:proofErr w:type="spellStart"/>
+      <w:r>
+        <w:t>Tkinter</w:t>
+      </w:r>
+      <w:proofErr w:type="spellEnd"/>
+      <w:r>
+        <w:t xml:space="preserve"> application and is primarily developed and tested on Windows. The core program should remain portable as long as the required Python packages and </w:t>
+      </w:r>
+      <w:proofErr w:type="spellStart"/>
+      <w:r>
+        <w:t>Tcl</w:t>
+      </w:r>
+      <w:proofErr w:type="spellEnd"/>
+      <w:r>
+        <w:t>/Tk support are available.</w:t>
       </w:r>
     </w:p>
     <w:p>
@@ -529,8 +654,21 @@
       <w:pPr>
         <w:pStyle w:val="Felsorols"/>
       </w:pPr>
-      <w:r>
-        <w:t>Tkinter / Tcl-Tk.</w:t>
+      <w:proofErr w:type="spellStart"/>
+      <w:r>
+        <w:t>Tkinter</w:t>
+      </w:r>
+      <w:proofErr w:type="spellEnd"/>
+      <w:r>
+        <w:t xml:space="preserve"> / </w:t>
+      </w:r>
+      <w:proofErr w:type="spellStart"/>
+      <w:r>
+        <w:t>Tcl</w:t>
+      </w:r>
+      <w:proofErr w:type="spellEnd"/>
+      <w:r>
+        <w:t>-Tk.</w:t>
       </w:r>
     </w:p>
     <w:p>
@@ -545,13 +683,23 @@
       <w:pPr>
         <w:pStyle w:val="Felsorols"/>
       </w:pPr>
-      <w:r>
-        <w:t>brukeropus: optional; required for reading OPUS-like native files.</w:t>
-      </w:r>
-    </w:p>
-    <w:p>
-      <w:r>
-        <w:t>Tkinter is normally included with standard Python installations on Windows. On some Linux distributions it may need to be installed separately through the system package manager.</w:t>
+      <w:proofErr w:type="spellStart"/>
+      <w:r>
+        <w:t>brukeropus</w:t>
+      </w:r>
+      <w:proofErr w:type="spellEnd"/>
+      <w:r>
+        <w:t>: optional; required for reading OPUS-like native files.</w:t>
+      </w:r>
+    </w:p>
+    <w:p>
+      <w:proofErr w:type="spellStart"/>
+      <w:r>
+        <w:t>Tkinter</w:t>
+      </w:r>
+      <w:proofErr w:type="spellEnd"/>
+      <w:r>
+        <w:t xml:space="preserve"> is normally included with standard Python installations on Windows. On some Linux distributions it may need to be installed separately through the system package manager.</w:t>
       </w:r>
     </w:p>
     <w:p>
@@ -572,11 +720,32 @@
         <w:pStyle w:val="CodeBlock"/>
       </w:pPr>
       <w:r>
-        <w:t>python -m venv .venv</w:t>
-      </w:r>
+        <w:t xml:space="preserve">python -m </w:t>
+      </w:r>
+      <w:proofErr w:type="spellStart"/>
+      <w:r>
+        <w:t>venv</w:t>
+      </w:r>
+      <w:proofErr w:type="spellEnd"/>
+      <w:r>
+        <w:t xml:space="preserve"> .</w:t>
+      </w:r>
+      <w:proofErr w:type="spellStart"/>
+      <w:r>
+        <w:t>venv</w:t>
+      </w:r>
+      <w:proofErr w:type="spellEnd"/>
       <w:r>
         <w:br/>
-        <w:t>.venv\Scripts\activate</w:t>
+        <w:t>.</w:t>
+      </w:r>
+      <w:proofErr w:type="spellStart"/>
+      <w:r>
+        <w:t>venv</w:t>
+      </w:r>
+      <w:proofErr w:type="spellEnd"/>
+      <w:r>
+        <w:t>\Scripts\activate</w:t>
       </w:r>
       <w:r>
         <w:br/>
@@ -619,7 +788,15 @@
     </w:p>
     <w:p>
       <w:r>
-        <w:t>The SpectraViewer interface is intentionally simple. The upper part of the window contains the main file and folder controls, the central area displays the current spectrum, and the lower part contains the navigation buttons, display options, the Matplotlib toolbar, and the status bar.</w:t>
+        <w:t xml:space="preserve">The </w:t>
+      </w:r>
+      <w:proofErr w:type="spellStart"/>
+      <w:r>
+        <w:t>SpectraViewer</w:t>
+      </w:r>
+      <w:proofErr w:type="spellEnd"/>
+      <w:r>
+        <w:t xml:space="preserve"> interface is intentionally simple. The upper part of the window contains the main file and folder controls, the central area displays the current spectrum, and the lower part contains the navigation buttons, display options, the Matplotlib toolbar, and the status bar.</w:t>
       </w:r>
     </w:p>
     <w:p>
@@ -682,7 +859,15 @@
         <w:jc w:val="right"/>
       </w:pPr>
       <w:r>
-        <w:t>Figure 1. SpectraViewer main window with a loaded spectrum.</w:t>
+        <w:t xml:space="preserve">Figure 1. </w:t>
+      </w:r>
+      <w:proofErr w:type="spellStart"/>
+      <w:r>
+        <w:t>SpectraViewer</w:t>
+      </w:r>
+      <w:proofErr w:type="spellEnd"/>
+      <w:r>
+        <w:t xml:space="preserve"> main window with a loaded spectrum.</w:t>
       </w:r>
     </w:p>
     <w:p>
@@ -701,8 +886,8 @@
         <w:tblLook w:val="04A0" w:firstRow="1" w:lastRow="0" w:firstColumn="1" w:lastColumn="0" w:noHBand="0" w:noVBand="1"/>
       </w:tblPr>
       <w:tblGrid>
-        <w:gridCol w:w="2376"/>
-        <w:gridCol w:w="7704"/>
+        <w:gridCol w:w="2374"/>
+        <w:gridCol w:w="7696"/>
       </w:tblGrid>
       <w:tr>
         <w:trPr>
@@ -1127,7 +1312,15 @@
         <w:t xml:space="preserve">The central plot area shows the currently selected spectrum. The header above the plot displays the file name and, when available, the most relevant metadata fields such as sample name and sample form. </w:t>
       </w:r>
       <w:r>
-        <w:t>For OPUS files, SpectraViewer attempts to display the most recently edited metadata.</w:t>
+        <w:t xml:space="preserve">For OPUS files, </w:t>
+      </w:r>
+      <w:proofErr w:type="spellStart"/>
+      <w:r>
+        <w:t>SpectraViewer</w:t>
+      </w:r>
+      <w:proofErr w:type="spellEnd"/>
+      <w:r>
+        <w:t xml:space="preserve"> attempts to display the most recently edited metadata.</w:t>
       </w:r>
       <w:r>
         <w:t xml:space="preserve"> </w:t>
@@ -1151,7 +1344,15 @@
     </w:p>
     <w:p>
       <w:r>
-        <w:t>The Matplotlib toolbar below the plot provides standard viewing tools such as home view, pan, zoom, and subplot adjustment. SpectraViewer removes the default Matplotlib save button from the toolbar and provides its own Save image function instead.</w:t>
+        <w:t xml:space="preserve">The Matplotlib toolbar below the plot provides standard viewing tools such as home view, pan, zoom, and subplot adjustment. </w:t>
+      </w:r>
+      <w:proofErr w:type="spellStart"/>
+      <w:r>
+        <w:t>SpectraViewer</w:t>
+      </w:r>
+      <w:proofErr w:type="spellEnd"/>
+      <w:r>
+        <w:t xml:space="preserve"> removes the default Matplotlib save button from the toolbar and provides its own Save image function instead.</w:t>
       </w:r>
     </w:p>
     <w:p>
@@ -1177,7 +1378,15 @@
     </w:p>
     <w:p>
       <w:r>
-        <w:t>Use Folder… to select a directory. SpectraViewer scans the selected directory for supported spectrum files and builds a navigable list. If Include subfolders is active, the scan is recursive.</w:t>
+        <w:t xml:space="preserve">Use Folder… to select a directory. </w:t>
+      </w:r>
+      <w:proofErr w:type="spellStart"/>
+      <w:r>
+        <w:t>SpectraViewer</w:t>
+      </w:r>
+      <w:proofErr w:type="spellEnd"/>
+      <w:r>
+        <w:t xml:space="preserve"> scans the selected directory for supported spectrum files and builds a navigable list. If Include subfolders is active, the scan is recursive.</w:t>
       </w:r>
     </w:p>
     <w:p>
@@ -1190,7 +1399,15 @@
     </w:p>
     <w:p>
       <w:r>
-        <w:t>In normal mode, opening a single supported file does not necessarily create a one-file view. Instead, SpectraViewer uses the file as an entry point into its folder context and builds a list from the surrounding supported files. The selected file becomes the current position in that list.</w:t>
+        <w:t xml:space="preserve">In normal mode, opening a single supported file does not necessarily create a one-file view. Instead, </w:t>
+      </w:r>
+      <w:proofErr w:type="spellStart"/>
+      <w:r>
+        <w:t>SpectraViewer</w:t>
+      </w:r>
+      <w:proofErr w:type="spellEnd"/>
+      <w:r>
+        <w:t xml:space="preserve"> uses the file as an entry point into its folder context and builds a list from the surrounding supported files. The selected file becomes the current position in that list.</w:t>
       </w:r>
     </w:p>
     <w:p>
@@ -1203,7 +1420,15 @@
     </w:p>
     <w:p>
       <w:r>
-        <w:t>When multiple files are selected in the file dialog, SpectraViewer creates a custom list from the selected supported files. Unsupported items are skipped, and a warning may be displayed if unsupported files were selected.</w:t>
+        <w:t xml:space="preserve">When multiple files are selected in the file dialog, </w:t>
+      </w:r>
+      <w:proofErr w:type="spellStart"/>
+      <w:r>
+        <w:t>SpectraViewer</w:t>
+      </w:r>
+      <w:proofErr w:type="spellEnd"/>
+      <w:r>
+        <w:t xml:space="preserve"> creates a custom list from the selected supported files. Unsupported items are skipped, and a warning may be displayed if unsupported files were selected.</w:t>
       </w:r>
     </w:p>
     <w:p>
@@ -1216,7 +1441,15 @@
     </w:p>
     <w:p>
       <w:r>
-        <w:t>The Path field can be used to type or paste a file or folder path. Press Enter to open it. If the path is a folder, the folder is scanned. If the path is a supported spectrum file, SpectraViewer applies the current loading logic: folder context in normal mode, or one-file loading in Single file mode.</w:t>
+        <w:t xml:space="preserve">The Path field can be used to type or paste a file or folder path. Press Enter to open it. If the path is a folder, the folder is scanned. If the path is a supported spectrum file, </w:t>
+      </w:r>
+      <w:proofErr w:type="spellStart"/>
+      <w:r>
+        <w:t>SpectraViewer</w:t>
+      </w:r>
+      <w:proofErr w:type="spellEnd"/>
+      <w:r>
+        <w:t xml:space="preserve"> applies the current loading logic: folder context in normal mode, or one-file loading in Single file mode.</w:t>
       </w:r>
     </w:p>
     <w:p>
@@ -1235,7 +1468,15 @@
     <w:p>
       <w:r>
         <w:lastRenderedPageBreak/>
-        <w:t>When Single file mode is enabled, the Include subfolders option is temporarily disabled. SpectraViewer preserves the previous Include subfolders state internally. If a spectrum is already loaded, the active list is reduced to the current file and the counter changes to 1/1.</w:t>
+        <w:t xml:space="preserve">When Single file mode is enabled, the Include subfolders option is temporarily disabled. </w:t>
+      </w:r>
+      <w:proofErr w:type="spellStart"/>
+      <w:r>
+        <w:t>SpectraViewer</w:t>
+      </w:r>
+      <w:proofErr w:type="spellEnd"/>
+      <w:r>
+        <w:t xml:space="preserve"> preserves the previous Include subfolders state internally. If a spectrum is already loaded, the active list is reduced to the current file and the counter changes to 1/1.</w:t>
       </w:r>
     </w:p>
     <w:p>
@@ -1285,7 +1526,15 @@
     </w:p>
     <w:p>
       <w:r>
-        <w:t>When Single file mode is turned off, SpectraViewer restores the previous Include subfolders setting and attempts to rebuild the folder context from the current spectrum. If the restored list contains at least two spectra, navigation becomes available again.</w:t>
+        <w:t xml:space="preserve">When Single file mode is turned off, </w:t>
+      </w:r>
+      <w:proofErr w:type="spellStart"/>
+      <w:r>
+        <w:t>SpectraViewer</w:t>
+      </w:r>
+      <w:proofErr w:type="spellEnd"/>
+      <w:r>
+        <w:t xml:space="preserve"> restores the previous Include subfolders setting and attempts to rebuild the folder context from the current spectrum. If the restored list contains at least two spectra, navigation becomes available again.</w:t>
       </w:r>
     </w:p>
     <w:p>
@@ -1306,7 +1555,23 @@
     </w:p>
     <w:p>
       <w:r>
-        <w:t>The Previous and Next buttons move through the active list. Navigation wraps around at the beginning and end of the list. The Home and End keys jump to the first and last item, while PageUp and PageDown jump by larger steps.</w:t>
+        <w:t xml:space="preserve">The Previous and Next buttons move through the active list. Navigation wraps around at the beginning and end of the list. The Home and End keys jump to the first and last item, while </w:t>
+      </w:r>
+      <w:proofErr w:type="spellStart"/>
+      <w:r>
+        <w:t>PageUp</w:t>
+      </w:r>
+      <w:proofErr w:type="spellEnd"/>
+      <w:r>
+        <w:t xml:space="preserve"> and </w:t>
+      </w:r>
+      <w:proofErr w:type="spellStart"/>
+      <w:r>
+        <w:t>PageDown</w:t>
+      </w:r>
+      <w:proofErr w:type="spellEnd"/>
+      <w:r>
+        <w:t xml:space="preserve"> jump by larger steps.</w:t>
       </w:r>
     </w:p>
     <w:p>
@@ -1363,7 +1628,15 @@
     </w:p>
     <w:p>
       <w:r>
-        <w:t>If tkinterdnd2 is available, SpectraViewer accepts drag-and-drop input from the file manager. Users can drop one or more files, folders, or mixed selections onto the application window.</w:t>
+        <w:t xml:space="preserve">If tkinterdnd2 is available, </w:t>
+      </w:r>
+      <w:proofErr w:type="spellStart"/>
+      <w:r>
+        <w:t>SpectraViewer</w:t>
+      </w:r>
+      <w:proofErr w:type="spellEnd"/>
+      <w:r>
+        <w:t xml:space="preserve"> accepts drag-and-drop input from the file manager. Users can drop one or more files, folders, or mixed selections onto the application window.</w:t>
       </w:r>
     </w:p>
     <w:p>
@@ -1379,7 +1652,15 @@
     <w:p>
       <w:r>
         <w:lastRenderedPageBreak/>
-        <w:t>This behavior is useful when files are selected manually from different folders or from a Windows Explorer search result and then dropped into SpectraViewer as a temporary browsing set.</w:t>
+        <w:t xml:space="preserve">This behavior is useful when files are selected manually from different folders or from a Windows Explorer search result and then dropped into </w:t>
+      </w:r>
+      <w:proofErr w:type="spellStart"/>
+      <w:r>
+        <w:t>SpectraViewer</w:t>
+      </w:r>
+      <w:proofErr w:type="spellEnd"/>
+      <w:r>
+        <w:t xml:space="preserve"> as a temporary browsing set.</w:t>
       </w:r>
     </w:p>
     <w:p>
@@ -1410,7 +1691,16 @@
     </w:p>
     <w:p>
       <w:r>
-        <w:t>Version 1.1.6 introduces settings memory. When the program exits, it automatically saves the most important user settings to SpectraViewer.ini, located in the same folder as the program. If the INI file does not yet exist, the program creates it.</w:t>
+        <w:t xml:space="preserve">Version </w:t>
+      </w:r>
+      <w:r>
+        <w:t>1.1.</w:t>
+      </w:r>
+      <w:r>
+        <w:t>6</w:t>
+      </w:r>
+      <w:r>
+        <w:t xml:space="preserve"> introduces settings memory. When the program exits, it automatically saves the most important user settings to SpectraViewer.ini, located in the same folder as the program. If the INI file does not yet exist, the program creates it.</w:t>
       </w:r>
     </w:p>
     <w:p>
@@ -1484,7 +1774,15 @@
     </w:p>
     <w:p>
       <w:r>
-        <w:t>At startup, the program loads the state stored in the INI file. If the last used path still exists, SpectraViewer automatically attempts to restore the corresponding file or folder according to the saved settings. If the path no longer exists, the program does not display a separate warning dialog; instead, it reports the problem in the status bar.</w:t>
+        <w:t xml:space="preserve">At startup, the program loads the state stored in the INI file. If the last used path still exists, </w:t>
+      </w:r>
+      <w:proofErr w:type="spellStart"/>
+      <w:r>
+        <w:t>SpectraViewer</w:t>
+      </w:r>
+      <w:proofErr w:type="spellEnd"/>
+      <w:r>
+        <w:t xml:space="preserve"> automatically attempts to restore the corresponding file or folder according to the saved settings. If the path no longer exists, the program does not display a separate warning dialog; instead, it reports the problem in the status bar.</w:t>
       </w:r>
     </w:p>
     <w:p>
@@ -1510,12 +1808,29 @@
     </w:p>
     <w:p>
       <w:r>
-        <w:t>Version 1.1.6 adds the Metadata encoding drop-down list. The purpose of this feature is to let the user try to improve the display of metadata that appears incorrectly because of a different or problematic text encoding.</w:t>
-      </w:r>
-    </w:p>
-    <w:p>
-      <w:r>
-        <w:t>This setting affects metadata display only. SpectraViewer does not physically rewrite or recode spectrum files, and the x/y spectrum data are not changed. The feature works as a display override.</w:t>
+        <w:t xml:space="preserve">Version </w:t>
+      </w:r>
+      <w:r>
+        <w:t>1.1.</w:t>
+      </w:r>
+      <w:r>
+        <w:t>6</w:t>
+      </w:r>
+      <w:r>
+        <w:t xml:space="preserve"> adds the Metadata encoding drop-down list. The purpose of this feature is to let the user try to improve the display of metadata that appears incorrectly because of a different or problematic text encoding.</w:t>
+      </w:r>
+    </w:p>
+    <w:p>
+      <w:r>
+        <w:t xml:space="preserve">This setting affects metadata display only. </w:t>
+      </w:r>
+      <w:proofErr w:type="spellStart"/>
+      <w:r>
+        <w:t>SpectraViewer</w:t>
+      </w:r>
+      <w:proofErr w:type="spellEnd"/>
+      <w:r>
+        <w:t xml:space="preserve"> does not physically rewrite or recode spectrum files, and the x/y spectrum data are not changed. The feature works as a display override.</w:t>
       </w:r>
     </w:p>
     <w:p>
@@ -1579,7 +1894,15 @@
     </w:p>
     <w:p>
       <w:r>
-        <w:t>Auto / OPUS default preserves the previous SpectraViewer behavior. Manual options such as Windows-1250, Windows-1252, UTF-8, Latin-1, and Latin-2 let the user test alternative decoding settings when metadata appears garbled.</w:t>
+        <w:t xml:space="preserve">Auto / OPUS default preserves the previous </w:t>
+      </w:r>
+      <w:proofErr w:type="spellStart"/>
+      <w:r>
+        <w:t>SpectraViewer</w:t>
+      </w:r>
+      <w:proofErr w:type="spellEnd"/>
+      <w:r>
+        <w:t xml:space="preserve"> behavior. Manual options such as Windows-1250, Windows-1252, UTF-8, Latin-1, and Latin-2 let the user test alternative decoding settings when metadata appears garbled.</w:t>
       </w:r>
     </w:p>
     <w:p>
@@ -1604,13 +1927,23 @@
       </w:r>
     </w:p>
     <w:p>
-      <w:r>
-        <w:t>SpectraViewer is intended for viewing and browsing. It does not apply baseline correction, normalization, smoothing, spectral identification, database searching, or other analytical processing steps.</w:t>
-      </w:r>
-    </w:p>
-    <w:p>
-      <w:r>
-        <w:t>SpectraViewer displays a single spectrum at a time. It does not provide stacked or overlaid multi-spectrum views, as commonly used in dedicated spectral evaluation or processing software.</w:t>
+      <w:proofErr w:type="spellStart"/>
+      <w:r>
+        <w:t>SpectraViewer</w:t>
+      </w:r>
+      <w:proofErr w:type="spellEnd"/>
+      <w:r>
+        <w:t xml:space="preserve"> is intended for viewing and browsing. It does not apply baseline correction, normalization, smoothing, spectral identification, database searching, or other analytical processing steps.</w:t>
+      </w:r>
+    </w:p>
+    <w:p>
+      <w:proofErr w:type="spellStart"/>
+      <w:r>
+        <w:t>SpectraViewer</w:t>
+      </w:r>
+      <w:proofErr w:type="spellEnd"/>
+      <w:r>
+        <w:t xml:space="preserve"> displays a single spectrum at a time. It does not provide stacked or overlaid multi-spectrum views, as commonly used in dedicated spectral evaluation or processing software.</w:t>
       </w:r>
     </w:p>
     <w:p>
@@ -1623,7 +1956,15 @@
     </w:p>
     <w:p>
       <w:r>
-        <w:t>Some OPUS files can contain multiple data blocks, such as single-channel data, reference data, mapping points, images, or other auxiliary information. In such cases, SpectraViewer may not always display the spectrum that the user expects as the primary spectrum. If a complex OPUS file does not display correctly, extracting the desired spectrum within OPUS and opening the simpler extracted file may help.</w:t>
+        <w:t xml:space="preserve">Some OPUS files can contain multiple data blocks, such as single-channel data, reference data, mapping points, images, or other auxiliary information. In such cases, </w:t>
+      </w:r>
+      <w:proofErr w:type="spellStart"/>
+      <w:r>
+        <w:t>SpectraViewer</w:t>
+      </w:r>
+      <w:proofErr w:type="spellEnd"/>
+      <w:r>
+        <w:t xml:space="preserve"> may not always display the spectrum that the user expects as the primary spectrum. If a complex OPUS file does not display correctly, extracting the desired spectrum within OPUS and opening the simpler extracted file may help.</w:t>
       </w:r>
     </w:p>
     <w:p>
@@ -1636,7 +1977,15 @@
     </w:p>
     <w:p>
       <w:r>
-        <w:t>Different supported formats store metadata differently. Some files contain sample names, sample forms, or labels; others contain only x/y data. SpectraViewer displays available metadata when it can read it, but the absence of metadata is not treated as an error.</w:t>
+        <w:t xml:space="preserve">Different supported formats store metadata differently. Some files contain sample names, sample forms, or labels; others contain only x/y data. </w:t>
+      </w:r>
+      <w:proofErr w:type="spellStart"/>
+      <w:r>
+        <w:t>SpectraViewer</w:t>
+      </w:r>
+      <w:proofErr w:type="spellEnd"/>
+      <w:r>
+        <w:t xml:space="preserve"> displays available metadata when it can read it, but the absence of metadata is not treated as an error.</w:t>
       </w:r>
     </w:p>
     <w:p>
@@ -1649,7 +1998,15 @@
     </w:p>
     <w:p>
       <w:r>
-        <w:t>To avoid excessive memory use and very slow operation, SpectraViewer checks the number of files before replacing the active list. Large lists may trigger a warning. If a scan exceeds the configured maximum, the operation is cancelled and the previous valid list is preserved.</w:t>
+        <w:t xml:space="preserve">To avoid excessive memory use and very slow operation, </w:t>
+      </w:r>
+      <w:proofErr w:type="spellStart"/>
+      <w:r>
+        <w:t>SpectraViewer</w:t>
+      </w:r>
+      <w:proofErr w:type="spellEnd"/>
+      <w:r>
+        <w:t xml:space="preserve"> checks the number of files before replacing the active list. Large lists may trigger a warning. If a scan exceeds the configured maximum, the operation is cancelled and the previous valid list is preserved.</w:t>
       </w:r>
     </w:p>
     <w:p>
@@ -1666,29 +2023,63 @@
       </w:r>
     </w:p>
     <w:p>
-      <w:r>
-        <w:t>SpectraViewer 1.1.5 is archived on Zenodo and can be cited as research software.</w:t>
-      </w:r>
-    </w:p>
-    <w:p>
-      <w:r>
-        <w:t>Version DOI: 10.5281/zenodo.20715099</w:t>
-      </w:r>
-    </w:p>
-    <w:p>
-      <w:r>
-        <w:t>The GitHub repository also contains a CITATION.cff file so that GitHub can display citation information for the project.</w:t>
-      </w:r>
-    </w:p>
-    <w:p>
+      <w:proofErr w:type="spellStart"/>
+      <w:r>
+        <w:t>SpectraViewer</w:t>
+      </w:r>
+      <w:proofErr w:type="spellEnd"/>
+      <w:r>
+        <w:t xml:space="preserve"> is archived on </w:t>
+      </w:r>
+      <w:proofErr w:type="spellStart"/>
+      <w:r>
+        <w:t>Zenodo</w:t>
+      </w:r>
+      <w:proofErr w:type="spellEnd"/>
+      <w:r>
+        <w:t xml:space="preserve"> and can be cited as research software.</w:t>
+      </w:r>
+    </w:p>
+    <w:p>
+      <w:r>
+        <w:t xml:space="preserve">Version DOI: </w:t>
+      </w:r>
+      <w:r>
+        <w:t>10.5281/zenodo.20715098</w:t>
+      </w:r>
+    </w:p>
+    <w:p>
+      <w:r>
+        <w:t xml:space="preserve">The GitHub repository also contains a </w:t>
+      </w:r>
+      <w:proofErr w:type="spellStart"/>
+      <w:r>
+        <w:t>CITATION.cff</w:t>
+      </w:r>
+      <w:proofErr w:type="spellEnd"/>
+      <w:r>
+        <w:t xml:space="preserve"> file so that GitHub can display citation information for the project.</w:t>
+      </w:r>
+    </w:p>
+    <w:p>
+      <w:proofErr w:type="spellStart"/>
       <w:r>
         <w:lastRenderedPageBreak/>
-        <w:t>SpectraViewer is released under the MIT License. The license text is included in the repository as LICENSE.</w:t>
-      </w:r>
-    </w:p>
-    <w:p>
-      <w:r>
-        <w:t>SpectraViewer was developed by Zsolt Hidasi with assistance from OpenAI ChatGPT during design, refactoring, documentation, and release preparation.</w:t>
+        <w:t>SpectraViewer</w:t>
+      </w:r>
+      <w:proofErr w:type="spellEnd"/>
+      <w:r>
+        <w:t xml:space="preserve"> is released under the MIT License. The license text is included in the repository as LICENSE.</w:t>
+      </w:r>
+    </w:p>
+    <w:p>
+      <w:proofErr w:type="spellStart"/>
+      <w:r>
+        <w:t>SpectraViewer</w:t>
+      </w:r>
+      <w:proofErr w:type="spellEnd"/>
+      <w:r>
+        <w:t xml:space="preserve"> was developed by Zsolt Hidasi with assistance from OpenAI ChatGPT during design, refactoring, documentation, and release preparation.</w:t>
       </w:r>
     </w:p>
     <w:p>
@@ -1707,8 +2098,8 @@
         <w:tblLook w:val="04A0" w:firstRow="1" w:lastRow="0" w:firstColumn="1" w:lastColumn="0" w:noHBand="0" w:noVBand="1"/>
       </w:tblPr>
       <w:tblGrid>
-        <w:gridCol w:w="3168"/>
-        <w:gridCol w:w="6912"/>
+        <w:gridCol w:w="3166"/>
+        <w:gridCol w:w="6904"/>
       </w:tblGrid>
       <w:tr>
         <w:trPr>
@@ -1754,12 +2145,14 @@
             <w:tcW w:w="3168" w:type="dxa"/>
           </w:tcPr>
           <w:p>
+            <w:proofErr w:type="spellStart"/>
             <w:r>
               <w:rPr>
                 <w:sz w:val="19"/>
               </w:rPr>
               <w:t>Ctrl+O</w:t>
             </w:r>
+            <w:proofErr w:type="spellEnd"/>
           </w:p>
         </w:tc>
         <w:tc>
@@ -1785,12 +2178,14 @@
             <w:tcW w:w="3168" w:type="dxa"/>
           </w:tcPr>
           <w:p>
+            <w:proofErr w:type="spellStart"/>
             <w:r>
               <w:rPr>
                 <w:sz w:val="19"/>
               </w:rPr>
               <w:t>Ctrl+Shift+O</w:t>
             </w:r>
+            <w:proofErr w:type="spellEnd"/>
           </w:p>
         </w:tc>
         <w:tc>
@@ -1878,12 +2273,28 @@
             <w:tcW w:w="3168" w:type="dxa"/>
           </w:tcPr>
           <w:p>
+            <w:proofErr w:type="spellStart"/>
             <w:r>
               <w:rPr>
                 <w:sz w:val="19"/>
               </w:rPr>
-              <w:t>PageUp / PageDown</w:t>
+              <w:t>PageUp</w:t>
             </w:r>
+            <w:proofErr w:type="spellEnd"/>
+            <w:r>
+              <w:rPr>
+                <w:sz w:val="19"/>
+              </w:rPr>
+              <w:t xml:space="preserve"> / </w:t>
+            </w:r>
+            <w:proofErr w:type="spellStart"/>
+            <w:r>
+              <w:rPr>
+                <w:sz w:val="19"/>
+              </w:rPr>
+              <w:t>PageDown</w:t>
+            </w:r>
+            <w:proofErr w:type="spellEnd"/>
           </w:p>
         </w:tc>
         <w:tc>
@@ -1909,12 +2320,14 @@
             <w:tcW w:w="3168" w:type="dxa"/>
           </w:tcPr>
           <w:p>
+            <w:proofErr w:type="spellStart"/>
             <w:r>
               <w:rPr>
                 <w:sz w:val="19"/>
               </w:rPr>
               <w:t>Ctrl+S</w:t>
             </w:r>
+            <w:proofErr w:type="spellEnd"/>
           </w:p>
         </w:tc>
         <w:tc>
@@ -1940,12 +2353,14 @@
             <w:tcW w:w="3168" w:type="dxa"/>
           </w:tcPr>
           <w:p>
+            <w:proofErr w:type="spellStart"/>
             <w:r>
               <w:rPr>
                 <w:sz w:val="19"/>
               </w:rPr>
               <w:t>Ctrl+Shift+C</w:t>
             </w:r>
+            <w:proofErr w:type="spellEnd"/>
           </w:p>
         </w:tc>
         <w:tc>
@@ -2127,8 +2542,22 @@
       <w:pStyle w:val="llb"/>
       <w:jc w:val="center"/>
     </w:pPr>
+    <w:proofErr w:type="spellStart"/>
     <w:r>
-      <w:t>SpectraViewer 1.1.6 | Zsolt Hidasi | 2026</w:t>
+      <w:t>SpectraViewer</w:t>
+    </w:r>
+    <w:proofErr w:type="spellEnd"/>
+    <w:r>
+      <w:t xml:space="preserve"> </w:t>
+    </w:r>
+    <w:r>
+      <w:t>1.1.</w:t>
+    </w:r>
+    <w:r>
+      <w:t>6 and later</w:t>
+    </w:r>
+    <w:r>
+      <w:t xml:space="preserve"> | Zsolt Hidasi | 2026</w:t>
     </w:r>
   </w:p>
 </w:ftr>
@@ -2165,8 +2594,19 @@
     <w:pPr>
       <w:pStyle w:val="lfej"/>
     </w:pPr>
+    <w:proofErr w:type="spellStart"/>
     <w:r>
-      <w:t>SpectraViewer User Manual v1.1.6</w:t>
+      <w:t>SpectraViewer</w:t>
+    </w:r>
+    <w:proofErr w:type="spellEnd"/>
+    <w:r>
+      <w:t xml:space="preserve"> User Manual v</w:t>
+    </w:r>
+    <w:r>
+      <w:t>1.1.</w:t>
+    </w:r>
+    <w:r>
+      <w:t>6 and later</w:t>
     </w:r>
   </w:p>
 </w:hdr>

</xml_diff>